<commit_message>
refactor: rename package from yuntu_ascend_ocr to ascend_ocr
Co-Authored-By: Claude (mimo-v2.5) <noreply@anthropic.com>
</commit_message>
<xml_diff>
--- a/docs/模型转换文档.docx
+++ b/docs/模型转换文档.docx
@@ -213,16 +213,7 @@
           <w:rFonts w:hint="eastAsia"/>
           <w:lang w:val="en-US" w:eastAsia="zh-CN"/>
         </w:rPr>
-        <w:t>将转出来的模型重命名：v6</w:t>
-      </w:r>
-      <w:bookmarkStart w:id="0" w:name="_GoBack"/>
-      <w:bookmarkEnd w:id="0"/>
-      <w:r>
-        <w:rPr>
-          <w:rFonts w:hint="eastAsia"/>
-          <w:lang w:val="en-US" w:eastAsia="zh-CN"/>
-        </w:rPr>
-        <w:t>_small_det.onnx</w:t>
+        <w:t>将转出来的模型重命名：v6_small_det.onnx</w:t>
       </w:r>
     </w:p>
     <w:p>
@@ -260,35 +251,7 @@
           <w:rFonts w:hint="default"/>
           <w:lang w:val="en-US" w:eastAsia="zh-CN"/>
         </w:rPr>
-        <w:t>atc --model=./v6_small_det.onnx --framework=5 --output=./om/v6_small_det --input_shape="x:1,3,</w:t>
-      </w:r>
-      <w:r>
-        <w:rPr>
-          <w:rFonts w:hint="eastAsia"/>
-          <w:lang w:val="en-US" w:eastAsia="zh-CN"/>
-        </w:rPr>
-        <w:t>1600</w:t>
-      </w:r>
-      <w:r>
-        <w:rPr>
-          <w:rFonts w:hint="default"/>
-          <w:lang w:val="en-US" w:eastAsia="zh-CN"/>
-        </w:rPr>
-        <w:t>,</w:t>
-      </w:r>
-      <w:r>
-        <w:rPr>
-          <w:rFonts w:hint="eastAsia"/>
-          <w:lang w:val="en-US" w:eastAsia="zh-CN"/>
-        </w:rPr>
-        <w:t>1131</w:t>
-      </w:r>
-      <w:r>
-        <w:rPr>
-          <w:rFonts w:hint="default"/>
-          <w:lang w:val="en-US" w:eastAsia="zh-CN"/>
-        </w:rPr>
-        <w:t xml:space="preserve">"  --soc_version=Ascend310 </w:t>
+        <w:t xml:space="preserve">atc --model=./v6_small_det.onnx --framework=5 --output=./om/v6_small_det --input_shape="x:1,3,960,672"  --soc_version=Ascend310 </w:t>
       </w:r>
       <w:r>
         <w:rPr>
@@ -350,7 +313,7 @@
           <w:rFonts w:hint="eastAsia"/>
           <w:lang w:val="en-US" w:eastAsia="zh-CN"/>
         </w:rPr>
-        <w:t>转的模型是静态的，现在是顶死的最长边限制在1600。测试过静态的模型速度快，根建议据自己的业务场景把这个值定死。</w:t>
+        <w:t>转的模型是静态的，现在是定死的最长边限制在960。测试过静态的模型速度快，根建议据自己的业务场景把这个值定死。常见的是：960、1600等。根据你自己的图像设置</w:t>
       </w:r>
     </w:p>
     <w:p>
@@ -467,7 +430,7 @@
         <w:pStyle w:val="2"/>
         <w:bidi w:val="0"/>
         <w:rPr>
-          <w:rFonts w:hint="default"/>
+          <w:rFonts w:hint="eastAsia"/>
           <w:lang w:val="en-US" w:eastAsia="zh-CN"/>
         </w:rPr>
       </w:pPr>
@@ -477,6 +440,296 @@
           <w:lang w:val="en-US" w:eastAsia="zh-CN"/>
         </w:rPr>
         <w:t>如何构建镜像</w:t>
+      </w:r>
+    </w:p>
+    <w:p>
+      <w:pPr>
+        <w:rPr>
+          <w:rFonts w:hint="eastAsia"/>
+          <w:lang w:val="en-US" w:eastAsia="zh-CN"/>
+        </w:rPr>
+      </w:pPr>
+      <w:bookmarkStart w:id="0" w:name="_GoBack"/>
+      <w:bookmarkEnd w:id="0"/>
+    </w:p>
+    <w:p>
+      <w:pPr>
+        <w:rPr>
+          <w:rFonts w:hint="default"/>
+          <w:lang w:val="en-US" w:eastAsia="zh-CN"/>
+        </w:rPr>
+      </w:pPr>
+    </w:p>
+    <w:p>
+      <w:pPr>
+        <w:pStyle w:val="2"/>
+        <w:bidi w:val="0"/>
+        <w:rPr>
+          <w:rFonts w:hint="eastAsia"/>
+          <w:lang w:val="en-US" w:eastAsia="zh-CN"/>
+        </w:rPr>
+      </w:pPr>
+      <w:r>
+        <w:rPr>
+          <w:rFonts w:hint="eastAsia"/>
+          <w:lang w:val="en-US" w:eastAsia="zh-CN"/>
+        </w:rPr>
+        <w:t>如何启动镜像</w:t>
+      </w:r>
+    </w:p>
+    <w:p>
+      <w:pPr>
+        <w:rPr>
+          <w:rFonts w:hint="default"/>
+          <w:lang w:val="en-US" w:eastAsia="zh-CN"/>
+        </w:rPr>
+      </w:pPr>
+      <w:r>
+        <w:rPr>
+          <w:rFonts w:hint="default"/>
+          <w:lang w:val="en-US" w:eastAsia="zh-CN"/>
+        </w:rPr>
+        <w:t>docker run -it --rm \</w:t>
+      </w:r>
+    </w:p>
+    <w:p>
+      <w:pPr>
+        <w:rPr>
+          <w:rFonts w:hint="default"/>
+          <w:lang w:val="en-US" w:eastAsia="zh-CN"/>
+        </w:rPr>
+      </w:pPr>
+      <w:r>
+        <w:rPr>
+          <w:rFonts w:hint="default"/>
+          <w:lang w:val="en-US" w:eastAsia="zh-CN"/>
+        </w:rPr>
+        <w:t xml:space="preserve">  --name yuntu-ocr-npu4 \</w:t>
+      </w:r>
+    </w:p>
+    <w:p>
+      <w:pPr>
+        <w:rPr>
+          <w:rFonts w:hint="default"/>
+          <w:lang w:val="en-US" w:eastAsia="zh-CN"/>
+        </w:rPr>
+      </w:pPr>
+      <w:r>
+        <w:rPr>
+          <w:rFonts w:hint="default"/>
+          <w:lang w:val="en-US" w:eastAsia="zh-CN"/>
+        </w:rPr>
+        <w:t xml:space="preserve">  --device=/dev/davinci4:/dev/davinci0 \</w:t>
+      </w:r>
+    </w:p>
+    <w:p>
+      <w:pPr>
+        <w:rPr>
+          <w:rFonts w:hint="default"/>
+          <w:lang w:val="en-US" w:eastAsia="zh-CN"/>
+        </w:rPr>
+      </w:pPr>
+      <w:r>
+        <w:rPr>
+          <w:rFonts w:hint="default"/>
+          <w:lang w:val="en-US" w:eastAsia="zh-CN"/>
+        </w:rPr>
+        <w:t xml:space="preserve">  --device=/dev/davinci_manager \</w:t>
+      </w:r>
+    </w:p>
+    <w:p>
+      <w:pPr>
+        <w:rPr>
+          <w:rFonts w:hint="default"/>
+          <w:lang w:val="en-US" w:eastAsia="zh-CN"/>
+        </w:rPr>
+      </w:pPr>
+      <w:r>
+        <w:rPr>
+          <w:rFonts w:hint="default"/>
+          <w:lang w:val="en-US" w:eastAsia="zh-CN"/>
+        </w:rPr>
+        <w:t xml:space="preserve">  --device=/dev/devmm_svm \</w:t>
+      </w:r>
+    </w:p>
+    <w:p>
+      <w:pPr>
+        <w:rPr>
+          <w:rFonts w:hint="default"/>
+          <w:lang w:val="en-US" w:eastAsia="zh-CN"/>
+        </w:rPr>
+      </w:pPr>
+      <w:r>
+        <w:rPr>
+          <w:rFonts w:hint="default"/>
+          <w:lang w:val="en-US" w:eastAsia="zh-CN"/>
+        </w:rPr>
+        <w:t xml:space="preserve">  --device=/dev/hisi_hdc \</w:t>
+      </w:r>
+    </w:p>
+    <w:p>
+      <w:pPr>
+        <w:rPr>
+          <w:rFonts w:hint="default"/>
+          <w:lang w:val="en-US" w:eastAsia="zh-CN"/>
+        </w:rPr>
+      </w:pPr>
+      <w:r>
+        <w:rPr>
+          <w:rFonts w:hint="default"/>
+          <w:lang w:val="en-US" w:eastAsia="zh-CN"/>
+        </w:rPr>
+        <w:t xml:space="preserve">  -v /usr/local/Ascend/driver:/usr/local/Ascend/driver:ro \</w:t>
+      </w:r>
+    </w:p>
+    <w:p>
+      <w:pPr>
+        <w:rPr>
+          <w:rFonts w:hint="default"/>
+          <w:lang w:val="en-US" w:eastAsia="zh-CN"/>
+        </w:rPr>
+      </w:pPr>
+      <w:r>
+        <w:rPr>
+          <w:rFonts w:hint="default"/>
+          <w:lang w:val="en-US" w:eastAsia="zh-CN"/>
+        </w:rPr>
+        <w:t xml:space="preserve">  -v /usr/local/Ascend/driver/lib64:/usr/local/Ascend/driver/lib64:ro \</w:t>
+      </w:r>
+    </w:p>
+    <w:p>
+      <w:pPr>
+        <w:rPr>
+          <w:rFonts w:hint="default"/>
+          <w:lang w:val="en-US" w:eastAsia="zh-CN"/>
+        </w:rPr>
+      </w:pPr>
+      <w:r>
+        <w:rPr>
+          <w:rFonts w:hint="default"/>
+          <w:lang w:val="en-US" w:eastAsia="zh-CN"/>
+        </w:rPr>
+        <w:t xml:space="preserve">  -v /usr/local/Ascend/driver/version.info:/usr/local/Ascend/driver/version.info:ro \</w:t>
+      </w:r>
+    </w:p>
+    <w:p>
+      <w:pPr>
+        <w:rPr>
+          <w:rFonts w:hint="default"/>
+          <w:lang w:val="en-US" w:eastAsia="zh-CN"/>
+        </w:rPr>
+      </w:pPr>
+      <w:r>
+        <w:rPr>
+          <w:rFonts w:hint="default"/>
+          <w:lang w:val="en-US" w:eastAsia="zh-CN"/>
+        </w:rPr>
+        <w:t xml:space="preserve">  -v /usr/local/Ascend/add-ons:/usr/local/Ascend/add-ons:ro \</w:t>
+      </w:r>
+    </w:p>
+    <w:p>
+      <w:pPr>
+        <w:rPr>
+          <w:rFonts w:hint="default"/>
+          <w:lang w:val="en-US" w:eastAsia="zh-CN"/>
+        </w:rPr>
+      </w:pPr>
+      <w:r>
+        <w:rPr>
+          <w:rFonts w:hint="default"/>
+          <w:lang w:val="en-US" w:eastAsia="zh-CN"/>
+        </w:rPr>
+        <w:t xml:space="preserve">  -v /etc/ascend_install.info:/etc/ascend_install.info:ro \</w:t>
+      </w:r>
+    </w:p>
+    <w:p>
+      <w:pPr>
+        <w:rPr>
+          <w:rFonts w:hint="default"/>
+          <w:lang w:val="en-US" w:eastAsia="zh-CN"/>
+        </w:rPr>
+      </w:pPr>
+      <w:r>
+        <w:rPr>
+          <w:rFonts w:hint="default"/>
+          <w:lang w:val="en-US" w:eastAsia="zh-CN"/>
+        </w:rPr>
+        <w:t xml:space="preserve">  -v /usr/local/bin/npu-smi:/usr/local/bin/npu-smi:ro \</w:t>
+      </w:r>
+    </w:p>
+    <w:p>
+      <w:pPr>
+        <w:rPr>
+          <w:rFonts w:hint="default"/>
+          <w:lang w:val="en-US" w:eastAsia="zh-CN"/>
+        </w:rPr>
+      </w:pPr>
+      <w:r>
+        <w:rPr>
+          <w:rFonts w:hint="default"/>
+          <w:lang w:val="en-US" w:eastAsia="zh-CN"/>
+        </w:rPr>
+        <w:t xml:space="preserve">  -v /usr/local/dcmi:/usr/local/dcmi:ro \</w:t>
+      </w:r>
+    </w:p>
+    <w:p>
+      <w:pPr>
+        <w:rPr>
+          <w:rFonts w:hint="default"/>
+          <w:lang w:val="en-US" w:eastAsia="zh-CN"/>
+        </w:rPr>
+      </w:pPr>
+      <w:r>
+        <w:rPr>
+          <w:rFonts w:hint="default"/>
+          <w:lang w:val="en-US" w:eastAsia="zh-CN"/>
+        </w:rPr>
+        <w:t xml:space="preserve">  -e LD_LIBRARY_PATH=/usr/local/Ascend/driver/lib64:/usr/local/Ascend/driver/lib64/driver:/usr/local/Ascend/driver/lib64/common \</w:t>
+      </w:r>
+    </w:p>
+    <w:p>
+      <w:pPr>
+        <w:rPr>
+          <w:rFonts w:hint="default"/>
+          <w:lang w:val="en-US" w:eastAsia="zh-CN"/>
+        </w:rPr>
+      </w:pPr>
+      <w:r>
+        <w:rPr>
+          <w:rFonts w:hint="default"/>
+          <w:lang w:val="en-US" w:eastAsia="zh-CN"/>
+        </w:rPr>
+        <w:t xml:space="preserve">  --shm-size=8g \</w:t>
+      </w:r>
+    </w:p>
+    <w:p>
+      <w:pPr>
+        <w:rPr>
+          <w:rFonts w:hint="default"/>
+          <w:lang w:val="en-US" w:eastAsia="zh-CN"/>
+        </w:rPr>
+      </w:pPr>
+      <w:r>
+        <w:rPr>
+          <w:rFonts w:hint="default"/>
+          <w:lang w:val="en-US" w:eastAsia="zh-CN"/>
+        </w:rPr>
+        <w:t xml:space="preserve">  yuntu-ascend-ocr:310p \</w:t>
+      </w:r>
+    </w:p>
+    <w:p>
+      <w:pPr>
+        <w:rPr>
+          <w:rFonts w:hint="default"/>
+          <w:lang w:val="en-US" w:eastAsia="zh-CN"/>
+        </w:rPr>
+      </w:pPr>
+      <w:r>
+        <w:rPr>
+          <w:rFonts w:hint="default"/>
+          <w:lang w:val="en-US" w:eastAsia="zh-CN"/>
+        </w:rPr>
+        <w:t xml:space="preserve">  /bin/bash</w:t>
       </w:r>
     </w:p>
     <w:sectPr>

</xml_diff>

<commit_message>
fix: include all layout regions in API response + restore Dockerfile defaults
- layout-ocr API now returns all detected regions (table, seal, etc.)
  even if they have no OCR results, instead of only returning regions
  with text
- Restore Dockerfile to Huawei SWR base image, Tsinghua pip mirror,
  and default port 13502
- Update README port references to 13502
- Add table.jpg test image and update model conversion docs

Co-Authored-By: Claude (mimo-v2.5-pro) <noreply@anthropic.com>
</commit_message>
<xml_diff>
--- a/docs/模型转换文档.docx
+++ b/docs/模型转换文档.docx
@@ -427,6 +427,156 @@
     </w:p>
     <w:p>
       <w:pPr>
+        <w:rPr>
+          <w:rFonts w:hint="eastAsia"/>
+          <w:b/>
+          <w:bCs/>
+          <w:lang w:val="en-US" w:eastAsia="zh-CN"/>
+        </w:rPr>
+      </w:pPr>
+      <w:r>
+        <w:rPr>
+          <w:rFonts w:hint="eastAsia"/>
+          <w:b/>
+          <w:bCs/>
+          <w:lang w:val="en-US" w:eastAsia="zh-CN"/>
+        </w:rPr>
+        <w:t>版面分析模型，使用的是[PP-DocLayoutV3]</w:t>
+      </w:r>
+    </w:p>
+    <w:p>
+      <w:pPr>
+        <w:rPr>
+          <w:rFonts w:hint="default"/>
+          <w:b/>
+          <w:bCs/>
+          <w:lang w:val="en-US" w:eastAsia="zh-CN"/>
+        </w:rPr>
+      </w:pPr>
+    </w:p>
+    <w:p>
+      <w:pPr>
+        <w:rPr>
+          <w:rFonts w:hint="default"/>
+          <w:lang w:val="en-US" w:eastAsia="zh-CN"/>
+        </w:rPr>
+      </w:pPr>
+      <w:r>
+        <w:rPr>
+          <w:rFonts w:hint="default"/>
+          <w:lang w:val="en-US" w:eastAsia="zh-CN"/>
+        </w:rPr>
+        <w:t>atc --model=PP-DocLayoutV3.onnx \</w:t>
+      </w:r>
+    </w:p>
+    <w:p>
+      <w:pPr>
+        <w:rPr>
+          <w:rFonts w:hint="default"/>
+          <w:lang w:val="en-US" w:eastAsia="zh-CN"/>
+        </w:rPr>
+      </w:pPr>
+      <w:r>
+        <w:rPr>
+          <w:rFonts w:hint="default"/>
+          <w:lang w:val="en-US" w:eastAsia="zh-CN"/>
+        </w:rPr>
+        <w:t xml:space="preserve">    --framework=5 \</w:t>
+      </w:r>
+    </w:p>
+    <w:p>
+      <w:pPr>
+        <w:rPr>
+          <w:rFonts w:hint="default"/>
+          <w:lang w:val="en-US" w:eastAsia="zh-CN"/>
+        </w:rPr>
+      </w:pPr>
+      <w:r>
+        <w:rPr>
+          <w:rFonts w:hint="default"/>
+          <w:lang w:val="en-US" w:eastAsia="zh-CN"/>
+        </w:rPr>
+        <w:t xml:space="preserve">    --output=ppdoclayoutv3_310p \</w:t>
+      </w:r>
+    </w:p>
+    <w:p>
+      <w:pPr>
+        <w:rPr>
+          <w:rFonts w:hint="default"/>
+          <w:lang w:val="en-US" w:eastAsia="zh-CN"/>
+        </w:rPr>
+      </w:pPr>
+      <w:r>
+        <w:rPr>
+          <w:rFonts w:hint="default"/>
+          <w:lang w:val="en-US" w:eastAsia="zh-CN"/>
+        </w:rPr>
+        <w:t xml:space="preserve">    --input_shape="im_shape:1,2;image:1,3,800,800;scale_factor:1,2" \</w:t>
+      </w:r>
+    </w:p>
+    <w:p>
+      <w:pPr>
+        <w:rPr>
+          <w:rFonts w:hint="default"/>
+          <w:lang w:val="en-US" w:eastAsia="zh-CN"/>
+        </w:rPr>
+      </w:pPr>
+      <w:r>
+        <w:rPr>
+          <w:rFonts w:hint="default"/>
+          <w:lang w:val="en-US" w:eastAsia="zh-CN"/>
+        </w:rPr>
+        <w:t xml:space="preserve">    --soc_version=Ascend3</w:t>
+      </w:r>
+      <w:r>
+        <w:rPr>
+          <w:rFonts w:hint="eastAsia"/>
+          <w:lang w:val="en-US" w:eastAsia="zh-CN"/>
+        </w:rPr>
+        <w:t>10</w:t>
+      </w:r>
+      <w:bookmarkStart w:id="0" w:name="_GoBack"/>
+      <w:bookmarkEnd w:id="0"/>
+      <w:r>
+        <w:rPr>
+          <w:rFonts w:hint="default"/>
+          <w:lang w:val="en-US" w:eastAsia="zh-CN"/>
+        </w:rPr>
+        <w:t xml:space="preserve"> \</w:t>
+      </w:r>
+    </w:p>
+    <w:p>
+      <w:pPr>
+        <w:rPr>
+          <w:rFonts w:hint="default"/>
+          <w:lang w:val="en-US" w:eastAsia="zh-CN"/>
+        </w:rPr>
+      </w:pPr>
+      <w:r>
+        <w:rPr>
+          <w:rFonts w:hint="default"/>
+          <w:lang w:val="en-US" w:eastAsia="zh-CN"/>
+        </w:rPr>
+        <w:t xml:space="preserve">    --input_format=ND \</w:t>
+      </w:r>
+    </w:p>
+    <w:p>
+      <w:pPr>
+        <w:rPr>
+          <w:rFonts w:hint="default"/>
+          <w:lang w:val="en-US" w:eastAsia="zh-CN"/>
+        </w:rPr>
+      </w:pPr>
+      <w:r>
+        <w:rPr>
+          <w:rFonts w:hint="default"/>
+          <w:lang w:val="en-US" w:eastAsia="zh-CN"/>
+        </w:rPr>
+        <w:t xml:space="preserve">    --precision_mode=allow_fp32_to_fp16</w:t>
+      </w:r>
+    </w:p>
+    <w:p>
+      <w:pPr>
         <w:pStyle w:val="2"/>
         <w:bidi w:val="0"/>
         <w:rPr>
@@ -449,8 +599,13 @@
           <w:lang w:val="en-US" w:eastAsia="zh-CN"/>
         </w:rPr>
       </w:pPr>
-      <w:bookmarkStart w:id="0" w:name="_GoBack"/>
-      <w:bookmarkEnd w:id="0"/>
+      <w:r>
+        <w:rPr>
+          <w:rFonts w:hint="eastAsia"/>
+          <w:lang w:val="en-US" w:eastAsia="zh-CN"/>
+        </w:rPr>
+        <w:t>docker build -t ascend-ocr:310p .</w:t>
+      </w:r>
     </w:p>
     <w:p>
       <w:pPr>
@@ -486,250 +641,303 @@
       </w:pPr>
       <w:r>
         <w:rPr>
-          <w:rFonts w:hint="default"/>
-          <w:lang w:val="en-US" w:eastAsia="zh-CN"/>
-        </w:rPr>
-        <w:t>docker run -it --rm \</w:t>
-      </w:r>
-    </w:p>
-    <w:p>
-      <w:pPr>
-        <w:rPr>
-          <w:rFonts w:hint="default"/>
-          <w:lang w:val="en-US" w:eastAsia="zh-CN"/>
-        </w:rPr>
-      </w:pPr>
-      <w:r>
-        <w:rPr>
-          <w:rFonts w:hint="default"/>
-          <w:lang w:val="en-US" w:eastAsia="zh-CN"/>
-        </w:rPr>
-        <w:t xml:space="preserve">  --name yuntu-ocr-npu4 \</w:t>
-      </w:r>
-    </w:p>
-    <w:p>
-      <w:pPr>
-        <w:rPr>
-          <w:rFonts w:hint="default"/>
-          <w:lang w:val="en-US" w:eastAsia="zh-CN"/>
-        </w:rPr>
-      </w:pPr>
-      <w:r>
-        <w:rPr>
-          <w:rFonts w:hint="default"/>
-          <w:lang w:val="en-US" w:eastAsia="zh-CN"/>
-        </w:rPr>
-        <w:t xml:space="preserve">  --device=/dev/davinci4:/dev/davinci0 \</w:t>
-      </w:r>
-    </w:p>
-    <w:p>
-      <w:pPr>
-        <w:rPr>
-          <w:rFonts w:hint="default"/>
-          <w:lang w:val="en-US" w:eastAsia="zh-CN"/>
-        </w:rPr>
-      </w:pPr>
-      <w:r>
-        <w:rPr>
-          <w:rFonts w:hint="default"/>
-          <w:lang w:val="en-US" w:eastAsia="zh-CN"/>
-        </w:rPr>
-        <w:t xml:space="preserve">  --device=/dev/davinci_manager \</w:t>
-      </w:r>
-    </w:p>
-    <w:p>
-      <w:pPr>
-        <w:rPr>
-          <w:rFonts w:hint="default"/>
-          <w:lang w:val="en-US" w:eastAsia="zh-CN"/>
-        </w:rPr>
-      </w:pPr>
-      <w:r>
-        <w:rPr>
-          <w:rFonts w:hint="default"/>
-          <w:lang w:val="en-US" w:eastAsia="zh-CN"/>
-        </w:rPr>
-        <w:t xml:space="preserve">  --device=/dev/devmm_svm \</w:t>
-      </w:r>
-    </w:p>
-    <w:p>
-      <w:pPr>
-        <w:rPr>
-          <w:rFonts w:hint="default"/>
-          <w:lang w:val="en-US" w:eastAsia="zh-CN"/>
-        </w:rPr>
-      </w:pPr>
-      <w:r>
-        <w:rPr>
-          <w:rFonts w:hint="default"/>
-          <w:lang w:val="en-US" w:eastAsia="zh-CN"/>
-        </w:rPr>
-        <w:t xml:space="preserve">  --device=/dev/hisi_hdc \</w:t>
-      </w:r>
-    </w:p>
-    <w:p>
-      <w:pPr>
-        <w:rPr>
-          <w:rFonts w:hint="default"/>
-          <w:lang w:val="en-US" w:eastAsia="zh-CN"/>
-        </w:rPr>
-      </w:pPr>
-      <w:r>
-        <w:rPr>
-          <w:rFonts w:hint="default"/>
-          <w:lang w:val="en-US" w:eastAsia="zh-CN"/>
-        </w:rPr>
-        <w:t xml:space="preserve">  -v /usr/local/Ascend/driver:/usr/local/Ascend/driver:ro \</w:t>
-      </w:r>
-    </w:p>
-    <w:p>
-      <w:pPr>
-        <w:rPr>
-          <w:rFonts w:hint="default"/>
-          <w:lang w:val="en-US" w:eastAsia="zh-CN"/>
-        </w:rPr>
-      </w:pPr>
-      <w:r>
-        <w:rPr>
-          <w:rFonts w:hint="default"/>
-          <w:lang w:val="en-US" w:eastAsia="zh-CN"/>
-        </w:rPr>
-        <w:t xml:space="preserve">  -v /usr/local/Ascend/driver/lib64:/usr/local/Ascend/driver/lib64:ro \</w:t>
-      </w:r>
-    </w:p>
-    <w:p>
-      <w:pPr>
-        <w:rPr>
-          <w:rFonts w:hint="default"/>
-          <w:lang w:val="en-US" w:eastAsia="zh-CN"/>
-        </w:rPr>
-      </w:pPr>
-      <w:r>
-        <w:rPr>
-          <w:rFonts w:hint="default"/>
-          <w:lang w:val="en-US" w:eastAsia="zh-CN"/>
-        </w:rPr>
-        <w:t xml:space="preserve">  -v /usr/local/Ascend/driver/version.info:/usr/local/Ascend/driver/version.info:ro \</w:t>
-      </w:r>
-    </w:p>
-    <w:p>
-      <w:pPr>
-        <w:rPr>
-          <w:rFonts w:hint="default"/>
-          <w:lang w:val="en-US" w:eastAsia="zh-CN"/>
-        </w:rPr>
-      </w:pPr>
-      <w:r>
-        <w:rPr>
-          <w:rFonts w:hint="default"/>
-          <w:lang w:val="en-US" w:eastAsia="zh-CN"/>
-        </w:rPr>
-        <w:t xml:space="preserve">  -v /usr/local/Ascend/add-ons:/usr/local/Ascend/add-ons:ro \</w:t>
-      </w:r>
-    </w:p>
-    <w:p>
-      <w:pPr>
-        <w:rPr>
-          <w:rFonts w:hint="default"/>
-          <w:lang w:val="en-US" w:eastAsia="zh-CN"/>
-        </w:rPr>
-      </w:pPr>
-      <w:r>
-        <w:rPr>
-          <w:rFonts w:hint="default"/>
-          <w:lang w:val="en-US" w:eastAsia="zh-CN"/>
-        </w:rPr>
-        <w:t xml:space="preserve">  -v /etc/ascend_install.info:/etc/ascend_install.info:ro \</w:t>
-      </w:r>
-    </w:p>
-    <w:p>
-      <w:pPr>
-        <w:rPr>
-          <w:rFonts w:hint="default"/>
-          <w:lang w:val="en-US" w:eastAsia="zh-CN"/>
-        </w:rPr>
-      </w:pPr>
-      <w:r>
-        <w:rPr>
-          <w:rFonts w:hint="default"/>
-          <w:lang w:val="en-US" w:eastAsia="zh-CN"/>
-        </w:rPr>
-        <w:t xml:space="preserve">  -v /usr/local/bin/npu-smi:/usr/local/bin/npu-smi:ro \</w:t>
-      </w:r>
-    </w:p>
-    <w:p>
-      <w:pPr>
-        <w:rPr>
-          <w:rFonts w:hint="default"/>
-          <w:lang w:val="en-US" w:eastAsia="zh-CN"/>
-        </w:rPr>
-      </w:pPr>
-      <w:r>
-        <w:rPr>
-          <w:rFonts w:hint="default"/>
-          <w:lang w:val="en-US" w:eastAsia="zh-CN"/>
-        </w:rPr>
-        <w:t xml:space="preserve">  -v /usr/local/dcmi:/usr/local/dcmi:ro \</w:t>
-      </w:r>
-    </w:p>
-    <w:p>
-      <w:pPr>
-        <w:rPr>
-          <w:rFonts w:hint="default"/>
-          <w:lang w:val="en-US" w:eastAsia="zh-CN"/>
-        </w:rPr>
-      </w:pPr>
-      <w:r>
-        <w:rPr>
-          <w:rFonts w:hint="default"/>
-          <w:lang w:val="en-US" w:eastAsia="zh-CN"/>
-        </w:rPr>
-        <w:t xml:space="preserve">  -e LD_LIBRARY_PATH=/usr/local/Ascend/driver/lib64:/usr/local/Ascend/driver/lib64/driver:/usr/local/Ascend/driver/lib64/common \</w:t>
-      </w:r>
-    </w:p>
-    <w:p>
-      <w:pPr>
-        <w:rPr>
-          <w:rFonts w:hint="default"/>
-          <w:lang w:val="en-US" w:eastAsia="zh-CN"/>
-        </w:rPr>
-      </w:pPr>
-      <w:r>
-        <w:rPr>
-          <w:rFonts w:hint="default"/>
-          <w:lang w:val="en-US" w:eastAsia="zh-CN"/>
-        </w:rPr>
-        <w:t xml:space="preserve">  --shm-size=8g \</w:t>
-      </w:r>
-    </w:p>
-    <w:p>
-      <w:pPr>
-        <w:rPr>
-          <w:rFonts w:hint="default"/>
-          <w:lang w:val="en-US" w:eastAsia="zh-CN"/>
-        </w:rPr>
-      </w:pPr>
-      <w:r>
-        <w:rPr>
-          <w:rFonts w:hint="default"/>
-          <w:lang w:val="en-US" w:eastAsia="zh-CN"/>
-        </w:rPr>
-        <w:t xml:space="preserve">  yuntu-ascend-ocr:310p \</w:t>
-      </w:r>
-    </w:p>
-    <w:p>
-      <w:pPr>
-        <w:rPr>
-          <w:rFonts w:hint="default"/>
-          <w:lang w:val="en-US" w:eastAsia="zh-CN"/>
-        </w:rPr>
-      </w:pPr>
-      <w:r>
-        <w:rPr>
-          <w:rFonts w:hint="default"/>
-          <w:lang w:val="en-US" w:eastAsia="zh-CN"/>
-        </w:rPr>
-        <w:t xml:space="preserve">  /bin/bash</w:t>
+          <w:rFonts w:hint="eastAsia"/>
+          <w:lang w:val="en-US" w:eastAsia="zh-CN"/>
+        </w:rPr>
+        <w:t>我使用的是物理机的npu4进行的测试，在容器里对应的是第0个npu。</w:t>
+      </w:r>
+    </w:p>
+    <w:p>
+      <w:pPr>
+        <w:rPr>
+          <w:rFonts w:hint="default"/>
+          <w:lang w:val="en-US" w:eastAsia="zh-CN"/>
+        </w:rPr>
+      </w:pPr>
+    </w:p>
+    <w:p>
+      <w:pPr>
+        <w:rPr>
+          <w:rFonts w:hint="default"/>
+          <w:lang w:val="en-US" w:eastAsia="zh-CN"/>
+        </w:rPr>
+      </w:pPr>
+      <w:r>
+        <w:rPr>
+          <w:rFonts w:hint="default"/>
+          <w:lang w:val="en-US" w:eastAsia="zh-CN"/>
+        </w:rPr>
+        <w:t>docker run -d --restart unless-stopped \</w:t>
+      </w:r>
+    </w:p>
+    <w:p>
+      <w:pPr>
+        <w:rPr>
+          <w:rFonts w:hint="default"/>
+          <w:lang w:val="en-US" w:eastAsia="zh-CN"/>
+        </w:rPr>
+      </w:pPr>
+      <w:r>
+        <w:rPr>
+          <w:rFonts w:hint="default"/>
+          <w:lang w:val="en-US" w:eastAsia="zh-CN"/>
+        </w:rPr>
+        <w:t xml:space="preserve">    --name ascend-ocr \</w:t>
+      </w:r>
+    </w:p>
+    <w:p>
+      <w:pPr>
+        <w:rPr>
+          <w:rFonts w:hint="default"/>
+          <w:lang w:val="en-US" w:eastAsia="zh-CN"/>
+        </w:rPr>
+      </w:pPr>
+      <w:r>
+        <w:rPr>
+          <w:rFonts w:hint="default"/>
+          <w:lang w:val="en-US" w:eastAsia="zh-CN"/>
+        </w:rPr>
+        <w:t xml:space="preserve">    -p 13502:13502 \</w:t>
+      </w:r>
+    </w:p>
+    <w:p>
+      <w:pPr>
+        <w:rPr>
+          <w:rFonts w:hint="default"/>
+          <w:lang w:val="en-US" w:eastAsia="zh-CN"/>
+        </w:rPr>
+      </w:pPr>
+      <w:r>
+        <w:rPr>
+          <w:rFonts w:hint="default"/>
+          <w:lang w:val="en-US" w:eastAsia="zh-CN"/>
+        </w:rPr>
+        <w:t xml:space="preserve">    --device=/dev/davinci4:/dev/davinci0 \</w:t>
+      </w:r>
+    </w:p>
+    <w:p>
+      <w:pPr>
+        <w:rPr>
+          <w:rFonts w:hint="default"/>
+          <w:lang w:val="en-US" w:eastAsia="zh-CN"/>
+        </w:rPr>
+      </w:pPr>
+      <w:r>
+        <w:rPr>
+          <w:rFonts w:hint="default"/>
+          <w:lang w:val="en-US" w:eastAsia="zh-CN"/>
+        </w:rPr>
+        <w:t xml:space="preserve">    --device=/dev/davinci_manager \</w:t>
+      </w:r>
+    </w:p>
+    <w:p>
+      <w:pPr>
+        <w:rPr>
+          <w:rFonts w:hint="default"/>
+          <w:lang w:val="en-US" w:eastAsia="zh-CN"/>
+        </w:rPr>
+      </w:pPr>
+      <w:r>
+        <w:rPr>
+          <w:rFonts w:hint="default"/>
+          <w:lang w:val="en-US" w:eastAsia="zh-CN"/>
+        </w:rPr>
+        <w:t xml:space="preserve">    --device=/dev/devmm_svm \</w:t>
+      </w:r>
+    </w:p>
+    <w:p>
+      <w:pPr>
+        <w:rPr>
+          <w:rFonts w:hint="default"/>
+          <w:lang w:val="en-US" w:eastAsia="zh-CN"/>
+        </w:rPr>
+      </w:pPr>
+      <w:r>
+        <w:rPr>
+          <w:rFonts w:hint="default"/>
+          <w:lang w:val="en-US" w:eastAsia="zh-CN"/>
+        </w:rPr>
+        <w:t xml:space="preserve">    --device=/dev/hisi_hdc \</w:t>
+      </w:r>
+    </w:p>
+    <w:p>
+      <w:pPr>
+        <w:rPr>
+          <w:rFonts w:hint="default"/>
+          <w:lang w:val="en-US" w:eastAsia="zh-CN"/>
+        </w:rPr>
+      </w:pPr>
+      <w:r>
+        <w:rPr>
+          <w:rFonts w:hint="default"/>
+          <w:lang w:val="en-US" w:eastAsia="zh-CN"/>
+        </w:rPr>
+        <w:t xml:space="preserve">    -v /usr/local/Ascend/driver:/usr/local/Ascend/driver:ro \</w:t>
+      </w:r>
+    </w:p>
+    <w:p>
+      <w:pPr>
+        <w:rPr>
+          <w:rFonts w:hint="default"/>
+          <w:lang w:val="en-US" w:eastAsia="zh-CN"/>
+        </w:rPr>
+      </w:pPr>
+      <w:r>
+        <w:rPr>
+          <w:rFonts w:hint="default"/>
+          <w:lang w:val="en-US" w:eastAsia="zh-CN"/>
+        </w:rPr>
+        <w:t xml:space="preserve">    -v /usr/local/Ascend/driver/lib64:/usr/local/Ascend/driver/lib64:ro \</w:t>
+      </w:r>
+    </w:p>
+    <w:p>
+      <w:pPr>
+        <w:rPr>
+          <w:rFonts w:hint="default"/>
+          <w:lang w:val="en-US" w:eastAsia="zh-CN"/>
+        </w:rPr>
+      </w:pPr>
+      <w:r>
+        <w:rPr>
+          <w:rFonts w:hint="default"/>
+          <w:lang w:val="en-US" w:eastAsia="zh-CN"/>
+        </w:rPr>
+        <w:t xml:space="preserve">    -v /usr/local/Ascend/driver/version.info:/usr/local/Ascend/driver/version.info:ro \</w:t>
+      </w:r>
+    </w:p>
+    <w:p>
+      <w:pPr>
+        <w:rPr>
+          <w:rFonts w:hint="default"/>
+          <w:lang w:val="en-US" w:eastAsia="zh-CN"/>
+        </w:rPr>
+      </w:pPr>
+      <w:r>
+        <w:rPr>
+          <w:rFonts w:hint="default"/>
+          <w:lang w:val="en-US" w:eastAsia="zh-CN"/>
+        </w:rPr>
+        <w:t xml:space="preserve">    -v /usr/local/Ascend/add-ons:/usr/local/Ascend/add-ons:ro \</w:t>
+      </w:r>
+    </w:p>
+    <w:p>
+      <w:pPr>
+        <w:rPr>
+          <w:rFonts w:hint="default"/>
+          <w:lang w:val="en-US" w:eastAsia="zh-CN"/>
+        </w:rPr>
+      </w:pPr>
+      <w:r>
+        <w:rPr>
+          <w:rFonts w:hint="default"/>
+          <w:lang w:val="en-US" w:eastAsia="zh-CN"/>
+        </w:rPr>
+        <w:t xml:space="preserve">    -v /etc/ascend_install.info:/etc/ascend_install.info:ro \</w:t>
+      </w:r>
+    </w:p>
+    <w:p>
+      <w:pPr>
+        <w:rPr>
+          <w:rFonts w:hint="default"/>
+          <w:lang w:val="en-US" w:eastAsia="zh-CN"/>
+        </w:rPr>
+      </w:pPr>
+      <w:r>
+        <w:rPr>
+          <w:rFonts w:hint="default"/>
+          <w:lang w:val="en-US" w:eastAsia="zh-CN"/>
+        </w:rPr>
+        <w:t xml:space="preserve">    -v /usr/local/bin/npu-smi:/usr/local/bin/npu-smi:ro \</w:t>
+      </w:r>
+    </w:p>
+    <w:p>
+      <w:pPr>
+        <w:rPr>
+          <w:rFonts w:hint="default"/>
+          <w:lang w:val="en-US" w:eastAsia="zh-CN"/>
+        </w:rPr>
+      </w:pPr>
+      <w:r>
+        <w:rPr>
+          <w:rFonts w:hint="default"/>
+          <w:lang w:val="en-US" w:eastAsia="zh-CN"/>
+        </w:rPr>
+        <w:t xml:space="preserve">    -v /usr/local/dcmi:/usr/local/dcmi:ro \</w:t>
+      </w:r>
+    </w:p>
+    <w:p>
+      <w:pPr>
+        <w:rPr>
+          <w:rFonts w:hint="default"/>
+          <w:lang w:val="en-US" w:eastAsia="zh-CN"/>
+        </w:rPr>
+      </w:pPr>
+      <w:r>
+        <w:rPr>
+          <w:rFonts w:hint="default"/>
+          <w:lang w:val="en-US" w:eastAsia="zh-CN"/>
+        </w:rPr>
+        <w:t xml:space="preserve">    -v /opt/docimax/ascend-ocr/config.yaml:/workspace/config.yaml \</w:t>
+      </w:r>
+    </w:p>
+    <w:p>
+      <w:pPr>
+        <w:rPr>
+          <w:rFonts w:hint="default"/>
+          <w:lang w:val="en-US" w:eastAsia="zh-CN"/>
+        </w:rPr>
+      </w:pPr>
+      <w:r>
+        <w:rPr>
+          <w:rFonts w:hint="default"/>
+          <w:lang w:val="en-US" w:eastAsia="zh-CN"/>
+        </w:rPr>
+        <w:t xml:space="preserve">    -v /opt/docimax/ascend-ocr/data:/workspace/data \</w:t>
+      </w:r>
+    </w:p>
+    <w:p>
+      <w:pPr>
+        <w:rPr>
+          <w:rFonts w:hint="default"/>
+          <w:lang w:val="en-US" w:eastAsia="zh-CN"/>
+        </w:rPr>
+      </w:pPr>
+      <w:r>
+        <w:rPr>
+          <w:rFonts w:hint="default"/>
+          <w:lang w:val="en-US" w:eastAsia="zh-CN"/>
+        </w:rPr>
+        <w:t xml:space="preserve">    -e LD_LIBRARY_PATH=/usr/local/Ascend/driver/lib64:/usr/local/Ascend/driver/lib64/driver:/usr/local/Ascend/driver/lib64/common \</w:t>
+      </w:r>
+    </w:p>
+    <w:p>
+      <w:pPr>
+        <w:rPr>
+          <w:rFonts w:hint="default"/>
+          <w:lang w:val="en-US" w:eastAsia="zh-CN"/>
+        </w:rPr>
+      </w:pPr>
+      <w:r>
+        <w:rPr>
+          <w:rFonts w:hint="default"/>
+          <w:lang w:val="en-US" w:eastAsia="zh-CN"/>
+        </w:rPr>
+        <w:t xml:space="preserve">    --shm-size=8g \</w:t>
+      </w:r>
+    </w:p>
+    <w:p>
+      <w:pPr>
+        <w:rPr>
+          <w:rFonts w:hint="default"/>
+          <w:lang w:val="en-US" w:eastAsia="zh-CN"/>
+        </w:rPr>
+      </w:pPr>
+      <w:r>
+        <w:rPr>
+          <w:rFonts w:hint="default"/>
+          <w:lang w:val="en-US" w:eastAsia="zh-CN"/>
+        </w:rPr>
+        <w:t xml:space="preserve">    ascend-ocr:310p</w:t>
       </w:r>
     </w:p>
     <w:sectPr>
@@ -767,7 +975,7 @@
   <w:docDefaults>
     <w:rPrDefault>
       <w:rPr>
-        <w:rFonts w:asciiTheme="minorHAnsi" w:hAnsiTheme="minorHAnsi" w:eastAsiaTheme="minorEastAsia" w:cstheme="minorBidi"/>
+        <w:rFonts w:ascii="Times New Roman" w:hAnsi="Times New Roman" w:eastAsia="宋体" w:cs="Times New Roman"/>
       </w:rPr>
     </w:rPrDefault>
     <w:pPrDefault/>
@@ -1056,13 +1264,13 @@
       <w:sz w:val="32"/>
     </w:rPr>
   </w:style>
-  <w:style w:type="character" w:default="1" w:styleId="4">
+  <w:style w:type="character" w:default="1" w:styleId="5">
     <w:name w:val="Default Paragraph Font"/>
     <w:semiHidden/>
     <w:qFormat/>
     <w:uiPriority w:val="0"/>
   </w:style>
-  <w:style w:type="table" w:default="1" w:styleId="3">
+  <w:style w:type="table" w:default="1" w:styleId="4">
     <w:name w:val="Normal Table"/>
     <w:semiHidden/>
     <w:qFormat/>
@@ -1075,6 +1283,48 @@
         <w:right w:w="108" w:type="dxa"/>
       </w:tblCellMar>
     </w:tblPr>
+  </w:style>
+  <w:style w:type="paragraph" w:styleId="3">
+    <w:name w:val="HTML Preformatted"/>
+    <w:basedOn w:val="1"/>
+    <w:uiPriority w:val="0"/>
+    <w:pPr>
+      <w:tabs>
+        <w:tab w:val="left" w:pos="916"/>
+        <w:tab w:val="left" w:pos="1832"/>
+        <w:tab w:val="left" w:pos="2748"/>
+        <w:tab w:val="left" w:pos="3664"/>
+        <w:tab w:val="left" w:pos="4580"/>
+        <w:tab w:val="left" w:pos="5496"/>
+        <w:tab w:val="left" w:pos="6412"/>
+        <w:tab w:val="left" w:pos="7328"/>
+        <w:tab w:val="left" w:pos="8244"/>
+        <w:tab w:val="left" w:pos="9160"/>
+        <w:tab w:val="left" w:pos="10076"/>
+        <w:tab w:val="left" w:pos="10992"/>
+        <w:tab w:val="left" w:pos="11908"/>
+        <w:tab w:val="left" w:pos="12824"/>
+        <w:tab w:val="left" w:pos="13740"/>
+        <w:tab w:val="left" w:pos="14656"/>
+      </w:tabs>
+      <w:jc w:val="left"/>
+    </w:pPr>
+    <w:rPr>
+      <w:rFonts w:hint="eastAsia" w:ascii="宋体" w:hAnsi="宋体" w:eastAsia="宋体" w:cs="宋体"/>
+      <w:kern w:val="0"/>
+      <w:sz w:val="24"/>
+      <w:szCs w:val="24"/>
+      <w:lang w:val="en-US" w:eastAsia="zh-CN" w:bidi="ar"/>
+    </w:rPr>
+  </w:style>
+  <w:style w:type="character" w:styleId="6">
+    <w:name w:val="HTML Code"/>
+    <w:basedOn w:val="5"/>
+    <w:uiPriority w:val="0"/>
+    <w:rPr>
+      <w:rFonts w:ascii="Courier New" w:hAnsi="Courier New"/>
+      <w:sz w:val="20"/>
+    </w:rPr>
   </w:style>
 </w:styles>
 </file>

</xml_diff>